<commit_message>
paper: shorten abstract for application-note submission
</commit_message>
<xml_diff>
--- a/PAPER.docx
+++ b/PAPER.docx
@@ -38,17 +38,17 @@
     </w:p>
     <w:p>
       <w:r>
-        <w:t>**Motivation:** LightDock is an open-source docking framework based on the Glowworm Swarm Optimization (GSO) metaheuristic that offers 12 scoring functions and backbone flexibility via Anisotropic Network Models (ANM). The official LightDock Server was rewritten in Rust claiming "optimal speed and performance", yet no quantitative performance data were reported and the accompanying open-source Rust engine covers only 2 of the 12 scoring functions, carries runtime defects, and ships without automated tests.</w:t>
+        <w:t>**Motivation:** LightDock is an open-source docking framework based on Glowworm Swarm Optimization that offers 12 scoring functions and ANM backbone flexibility. Its Rust server was described as providing "optimal speed and performance", but the public Rust engine covers only 2 of the 12 scoring functions, has runtime defects, and ships without automated tests.</w:t>
       </w:r>
     </w:p>
     <w:p>
       <w:r>
-        <w:t>**Results:** We present **LKlight**, a complete Rust engine for the LightDock protocol. All 12 scoring functions are ported and numerically validated against the Python reference (48/48 comparisons pass, max |ΔE| = 4.85×10⁻⁷); three systematic defects of the official Rust baseline and one in LKlight's own DFIRE2 port are fixed (v1.1.0). A multi-tier optimization strategy delivers **13.0–107.5× speedups over the Python engine** on identical hardware and parameters; where the official Rust baseline does run (dna and the pyDock family), LKlight is 3.5–3.6× faster, and the baseline's startup failures on dfire (missing parameter file) and vdw (unsupported method name) are eliminated. On 30 Protein-Protein Docking Benchmark 5 complexes under the official blind-benchmark protocol, the mean CAPRI top-N success-rate curves of LKlight and the Python engine differ by ≤ 0.02 (McNemar p = 0.34, Wilcoxon p = 0.12; both non-significant), showing that the optimizations change speed, not docking outcomes. An extended robustness sweep (v1.1.0) further confirms 100% crash-free operation across a parameter-scaling grid, a 12-function × 6-complex native-pose scoring matrix, and full docking on four biomedical scenarios (p53–DNA, antibody–antigen, antibody–peptide, SARS-CoV-2 RBD–hACE2), with 3.5–3.6× (vs official Rust) and 12.5–13.6× (vs Python) speedups retained in head-to-head re-benchmarking on the same scenarios (§3.6). A protein–DNA indicator case study (§3.7) adds per-model Fnat, L-RMSD, iRMSD, DockQ and CAPRI classes together with an oracle decomposition that separates sampling from scoring: of 2,000 predicted poses none is CAPRI-acceptable, and enabling the ANM term improves the best sampled pose only marginally (L-RMSD 17.18 → 17.13 Å, DockQ 0.154 → 0.170) without closing that gap. Replicated runs (five timing repeats and six perturbed starting conditions) return equal best energies for the optimised and reference engines (Wilcoxon p = 1.0). §3.8 reports the head-to-head with the original LightDock and positions LKlight against mainstream docking programs. LKlight is distributed as a single cross-platform binary with all parameter data embedded.</w:t>
+        <w:t>**Results:** We present **LKlight**, a complete Rust engine for the LightDock protocol. All 12 scoring functions pass numerical validation against the Python reference (48/48; max |ΔE| = 4.85×10⁻⁷), and four baseline or implementation defects are fixed. Multi-tier optimization gives **13.0–107.5× speedups over Python**; where the official Rust baseline runs, LKlight is 3.5–3.6× faster. On 30 Protein-Protein Docking Benchmark 5 complexes under an official blind-benchmark protocol, mean CAPRI top-N success-rate curves differ by ≤ 0.02 (McNemar *p* = 0.34; Wilcoxon *p* = 0.12), indicating that the changes improve speed without altering docking outcomes. Robustness sweeps, 12-function scoring across six complexes, and four biomedical docking scenarios complete without crashes. A protein–DNA case study reports Fnat, L-RMSD, iRMSD, DockQ and CAPRI classes; none of 2,000 poses is CAPRI-acceptable, and ANM marginally improves the best pose without closing that gap. LKlight is distributed as a single cross-platform binary with all parameter data embedded.</w:t>
       </w:r>
     </w:p>
     <w:p>
       <w:r>
-        <w:t>**Availability:** https://github.com/LK-Studio1128/LKlight (GPL-3.0 derivative of LightDock); prebuilt macOS/Linux/Windows binaries and the full benchmark pipeline are in the repository.</w:t>
+        <w:t>**Availability:** https://github.com/LK-Studio1128/LKlight (GPL-3.0 derivative of LightDock); prebuilt macOS/Linux/Windows binaries and the benchmark pipeline are in the repository.</w:t>
       </w:r>
     </w:p>
     <w:p>

</xml_diff>